<commit_message>
alteração dos arquivos docx e pdf versao atualziada
</commit_message>
<xml_diff>
--- a/CV_Jefferson_Klamas_Marzani_sf.docx
+++ b/CV_Jefferson_Klamas_Marzani_sf.docx
@@ -16,7 +16,7 @@
           <w:szCs w:val="26"/>
         </w:rPr>
       </w:pPr>
-      <w:bookmarkStart w:colFirst="0" w:colLast="0" w:name="_i3spy4x6nq67" w:id="0"/>
+      <w:bookmarkStart w:colFirst="0" w:colLast="0" w:name="_heading=h.5hodyutpgvnc" w:id="0"/>
       <w:bookmarkEnd w:id="0"/>
       <w:r>
         <w:rPr>
@@ -47,24 +47,21 @@
         <w:rPr>
           <w:rtl w:val="0"/>
         </w:rPr>
-        <w:t xml:space="preserve"> | Salesforce Functional Analyst | Business Analyst</w:t>
+        <w:t xml:space="preserve"> | Salesforce Functional Analyst | Administrador Salesforce</w:t>
       </w:r>
     </w:p>
     <w:p>
       <w:pPr>
         <w:spacing w:after="240" w:before="240" w:line="240" w:lineRule="auto"/>
-        <w:rPr>
-          <w:color w:val="1155cc"/>
-          <w:u w:val="single"/>
-        </w:rPr>
-      </w:pPr>
-      <w:r>
-        <w:rPr>
-          <w:rtl w:val="0"/>
-        </w:rPr>
-        <w:t xml:space="preserve">Pinhais - Paraná | </w:t>
-      </w:r>
-      <w:hyperlink r:id="rId8">
+        <w:rPr/>
+      </w:pPr>
+      <w:r>
+        <w:rPr>
+          <w:rtl w:val="0"/>
+        </w:rPr>
+        <w:t xml:space="preserve">Pinhais - Paraná - Brasil | </w:t>
+      </w:r>
+      <w:hyperlink r:id="rId7">
         <w:r>
           <w:rPr>
             <w:color w:val="1155cc"/>
@@ -80,7 +77,7 @@
         </w:rPr>
         <w:t xml:space="preserve"> | </w:t>
       </w:r>
-      <w:hyperlink r:id="rId9">
+      <w:hyperlink r:id="rId8">
         <w:r>
           <w:rPr>
             <w:color w:val="1155cc"/>
@@ -96,7 +93,7 @@
         </w:rPr>
         <w:t xml:space="preserve"> | </w:t>
       </w:r>
-      <w:hyperlink r:id="rId6">
+      <w:hyperlink r:id="rId9">
         <w:r>
           <w:rPr>
             <w:color w:val="1155cc"/>
@@ -110,22 +107,7 @@
         <w:rPr>
           <w:rtl w:val="0"/>
         </w:rPr>
-        <w:t xml:space="preserve"> | </w:t>
-      </w:r>
-      <w:hyperlink r:id="rId7">
-        <w:r>
-          <w:rPr>
-            <w:color w:val="1155cc"/>
-            <w:u w:val="single"/>
-            <w:rtl w:val="0"/>
-          </w:rPr>
-          <w:t xml:space="preserve">Curriculo Online</w:t>
-        </w:r>
-      </w:hyperlink>
-      <w:r>
-        <w:rPr>
-          <w:rtl w:val="0"/>
-        </w:rPr>
+        <w:t xml:space="preserve"> </w:t>
       </w:r>
     </w:p>
     <w:p>
@@ -157,7 +139,7 @@
         <w:rPr>
           <w:rtl w:val="0"/>
         </w:rPr>
-        <w:t xml:space="preserve">Profissional de Tecnologia com experiência em</w:t>
+        <w:t xml:space="preserve">Profissional de Tecnologia com atuação em</w:t>
       </w:r>
       <w:r>
         <w:rPr>
@@ -317,7 +299,7 @@
           <w:ilvl w:val="0"/>
           <w:numId w:val="7"/>
         </w:numPr>
-        <w:spacing w:after="0" w:afterAutospacing="0" w:before="240" w:line="240" w:lineRule="auto"/>
+        <w:spacing w:after="0" w:before="240" w:line="240" w:lineRule="auto"/>
         <w:ind w:left="720" w:hanging="360"/>
         <w:rPr/>
       </w:pPr>
@@ -334,8 +316,9 @@
           <w:ilvl w:val="0"/>
           <w:numId w:val="7"/>
         </w:numPr>
-        <w:spacing w:after="0" w:afterAutospacing="0" w:before="0" w:beforeAutospacing="0" w:line="240" w:lineRule="auto"/>
-        <w:ind w:left="720" w:hanging="360"/>
+        <w:spacing w:after="0" w:before="0" w:line="240" w:lineRule="auto"/>
+        <w:ind w:left="720" w:hanging="360"/>
+        <w:rPr/>
       </w:pPr>
       <w:r>
         <w:rPr>
@@ -364,8 +347,9 @@
           <w:ilvl w:val="0"/>
           <w:numId w:val="7"/>
         </w:numPr>
-        <w:spacing w:after="0" w:afterAutospacing="0" w:before="0" w:beforeAutospacing="0" w:line="240" w:lineRule="auto"/>
-        <w:ind w:left="720" w:hanging="360"/>
+        <w:spacing w:after="0" w:before="0" w:line="240" w:lineRule="auto"/>
+        <w:ind w:left="720" w:hanging="360"/>
+        <w:rPr/>
       </w:pPr>
       <w:r>
         <w:rPr>
@@ -394,7 +378,7 @@
           <w:ilvl w:val="0"/>
           <w:numId w:val="7"/>
         </w:numPr>
-        <w:spacing w:after="0" w:afterAutospacing="0" w:before="0" w:beforeAutospacing="0" w:line="240" w:lineRule="auto"/>
+        <w:spacing w:after="0" w:before="0" w:line="240" w:lineRule="auto"/>
         <w:ind w:left="720" w:hanging="360"/>
         <w:rPr/>
       </w:pPr>
@@ -411,8 +395,9 @@
           <w:ilvl w:val="0"/>
           <w:numId w:val="7"/>
         </w:numPr>
-        <w:spacing w:after="0" w:afterAutospacing="0" w:before="0" w:beforeAutospacing="0" w:line="240" w:lineRule="auto"/>
-        <w:ind w:left="720" w:hanging="360"/>
+        <w:spacing w:after="0" w:before="0" w:line="240" w:lineRule="auto"/>
+        <w:ind w:left="720" w:hanging="360"/>
+        <w:rPr/>
       </w:pPr>
       <w:r>
         <w:rPr>
@@ -441,8 +426,9 @@
           <w:ilvl w:val="0"/>
           <w:numId w:val="7"/>
         </w:numPr>
-        <w:spacing w:after="0" w:afterAutospacing="0" w:before="0" w:beforeAutospacing="0" w:line="240" w:lineRule="auto"/>
-        <w:ind w:left="720" w:hanging="360"/>
+        <w:spacing w:after="0" w:before="0" w:line="240" w:lineRule="auto"/>
+        <w:ind w:left="720" w:hanging="360"/>
+        <w:rPr/>
       </w:pPr>
       <w:r>
         <w:rPr>
@@ -471,7 +457,7 @@
           <w:ilvl w:val="0"/>
           <w:numId w:val="7"/>
         </w:numPr>
-        <w:spacing w:after="0" w:afterAutospacing="0" w:before="0" w:beforeAutospacing="0" w:line="240" w:lineRule="auto"/>
+        <w:spacing w:after="0" w:before="0" w:line="240" w:lineRule="auto"/>
         <w:ind w:left="720" w:hanging="360"/>
         <w:rPr/>
       </w:pPr>
@@ -488,8 +474,9 @@
           <w:ilvl w:val="0"/>
           <w:numId w:val="7"/>
         </w:numPr>
-        <w:spacing w:after="0" w:afterAutospacing="0" w:before="0" w:beforeAutospacing="0" w:line="240" w:lineRule="auto"/>
-        <w:ind w:left="720" w:hanging="360"/>
+        <w:spacing w:after="0" w:before="0" w:line="240" w:lineRule="auto"/>
+        <w:ind w:left="720" w:hanging="360"/>
+        <w:rPr/>
       </w:pPr>
       <w:r>
         <w:rPr>
@@ -518,7 +505,7 @@
           <w:ilvl w:val="0"/>
           <w:numId w:val="7"/>
         </w:numPr>
-        <w:spacing w:after="0" w:afterAutospacing="0" w:before="0" w:beforeAutospacing="0" w:line="240" w:lineRule="auto"/>
+        <w:spacing w:after="0" w:before="0" w:line="240" w:lineRule="auto"/>
         <w:ind w:left="720" w:hanging="360"/>
         <w:rPr/>
       </w:pPr>
@@ -535,8 +522,9 @@
           <w:ilvl w:val="0"/>
           <w:numId w:val="7"/>
         </w:numPr>
-        <w:spacing w:after="0" w:afterAutospacing="0" w:before="0" w:beforeAutospacing="0" w:line="240" w:lineRule="auto"/>
-        <w:ind w:left="720" w:hanging="360"/>
+        <w:spacing w:after="0" w:before="0" w:line="240" w:lineRule="auto"/>
+        <w:ind w:left="720" w:hanging="360"/>
+        <w:rPr/>
       </w:pPr>
       <w:r>
         <w:rPr>
@@ -565,7 +553,7 @@
           <w:ilvl w:val="0"/>
           <w:numId w:val="7"/>
         </w:numPr>
-        <w:spacing w:after="0" w:afterAutospacing="0" w:before="0" w:beforeAutospacing="0" w:line="240" w:lineRule="auto"/>
+        <w:spacing w:after="0" w:before="0" w:line="240" w:lineRule="auto"/>
         <w:ind w:left="720" w:hanging="360"/>
         <w:rPr/>
       </w:pPr>
@@ -582,7 +570,7 @@
           <w:ilvl w:val="0"/>
           <w:numId w:val="7"/>
         </w:numPr>
-        <w:spacing w:after="240" w:before="0" w:beforeAutospacing="0" w:line="240" w:lineRule="auto"/>
+        <w:spacing w:after="240" w:before="0" w:line="240" w:lineRule="auto"/>
         <w:ind w:left="720" w:hanging="360"/>
         <w:rPr/>
       </w:pPr>
@@ -723,8 +711,9 @@
           <w:ilvl w:val="0"/>
           <w:numId w:val="8"/>
         </w:numPr>
-        <w:spacing w:after="0" w:afterAutospacing="0" w:before="240" w:line="240" w:lineRule="auto"/>
-        <w:ind w:left="720" w:hanging="360"/>
+        <w:spacing w:after="0" w:before="240" w:line="240" w:lineRule="auto"/>
+        <w:ind w:left="720" w:hanging="360"/>
+        <w:rPr/>
       </w:pPr>
       <w:r>
         <w:rPr>
@@ -753,7 +742,7 @@
           <w:ilvl w:val="0"/>
           <w:numId w:val="8"/>
         </w:numPr>
-        <w:spacing w:after="0" w:afterAutospacing="0" w:before="0" w:beforeAutospacing="0" w:line="240" w:lineRule="auto"/>
+        <w:spacing w:after="0" w:before="0" w:line="240" w:lineRule="auto"/>
         <w:ind w:left="720" w:hanging="360"/>
         <w:rPr/>
       </w:pPr>
@@ -770,8 +759,9 @@
           <w:ilvl w:val="0"/>
           <w:numId w:val="8"/>
         </w:numPr>
-        <w:spacing w:after="0" w:afterAutospacing="0" w:before="0" w:beforeAutospacing="0" w:line="240" w:lineRule="auto"/>
-        <w:ind w:left="720" w:hanging="360"/>
+        <w:spacing w:after="0" w:before="0" w:line="240" w:lineRule="auto"/>
+        <w:ind w:left="720" w:hanging="360"/>
+        <w:rPr/>
       </w:pPr>
       <w:r>
         <w:rPr>
@@ -800,8 +790,9 @@
           <w:ilvl w:val="0"/>
           <w:numId w:val="8"/>
         </w:numPr>
-        <w:spacing w:after="0" w:afterAutospacing="0" w:before="0" w:beforeAutospacing="0" w:line="240" w:lineRule="auto"/>
-        <w:ind w:left="720" w:hanging="360"/>
+        <w:spacing w:after="0" w:before="0" w:line="240" w:lineRule="auto"/>
+        <w:ind w:left="720" w:hanging="360"/>
+        <w:rPr/>
       </w:pPr>
       <w:r>
         <w:rPr>
@@ -830,7 +821,7 @@
           <w:ilvl w:val="0"/>
           <w:numId w:val="8"/>
         </w:numPr>
-        <w:spacing w:after="0" w:afterAutospacing="0" w:before="0" w:beforeAutospacing="0" w:line="240" w:lineRule="auto"/>
+        <w:spacing w:after="0" w:before="0" w:line="240" w:lineRule="auto"/>
         <w:ind w:left="720" w:hanging="360"/>
         <w:rPr/>
       </w:pPr>
@@ -847,7 +838,7 @@
           <w:ilvl w:val="0"/>
           <w:numId w:val="8"/>
         </w:numPr>
-        <w:spacing w:after="0" w:afterAutospacing="0" w:before="0" w:beforeAutospacing="0" w:line="240" w:lineRule="auto"/>
+        <w:spacing w:after="0" w:before="0" w:line="240" w:lineRule="auto"/>
         <w:ind w:left="720" w:hanging="360"/>
         <w:rPr/>
       </w:pPr>
@@ -864,8 +855,9 @@
           <w:ilvl w:val="0"/>
           <w:numId w:val="8"/>
         </w:numPr>
-        <w:spacing w:after="0" w:afterAutospacing="0" w:before="0" w:beforeAutospacing="0" w:line="240" w:lineRule="auto"/>
-        <w:ind w:left="720" w:hanging="360"/>
+        <w:spacing w:after="0" w:before="0" w:line="240" w:lineRule="auto"/>
+        <w:ind w:left="720" w:hanging="360"/>
+        <w:rPr/>
       </w:pPr>
       <w:r>
         <w:rPr>
@@ -894,8 +886,9 @@
           <w:ilvl w:val="0"/>
           <w:numId w:val="8"/>
         </w:numPr>
-        <w:spacing w:after="240" w:before="0" w:beforeAutospacing="0" w:line="240" w:lineRule="auto"/>
-        <w:ind w:left="720" w:hanging="360"/>
+        <w:spacing w:after="240" w:before="0" w:line="240" w:lineRule="auto"/>
+        <w:ind w:left="720" w:hanging="360"/>
+        <w:rPr/>
       </w:pPr>
       <w:r>
         <w:rPr>
@@ -978,7 +971,7 @@
           <w:ilvl w:val="0"/>
           <w:numId w:val="6"/>
         </w:numPr>
-        <w:spacing w:after="0" w:afterAutospacing="0" w:before="240" w:line="240" w:lineRule="auto"/>
+        <w:spacing w:after="0" w:before="240" w:line="240" w:lineRule="auto"/>
         <w:ind w:left="720" w:hanging="360"/>
         <w:rPr/>
       </w:pPr>
@@ -995,7 +988,7 @@
           <w:ilvl w:val="0"/>
           <w:numId w:val="6"/>
         </w:numPr>
-        <w:spacing w:after="0" w:afterAutospacing="0" w:before="0" w:beforeAutospacing="0" w:line="240" w:lineRule="auto"/>
+        <w:spacing w:after="0" w:before="0" w:line="240" w:lineRule="auto"/>
         <w:ind w:left="720" w:hanging="360"/>
         <w:rPr/>
       </w:pPr>
@@ -1012,8 +1005,9 @@
           <w:ilvl w:val="0"/>
           <w:numId w:val="6"/>
         </w:numPr>
-        <w:spacing w:after="0" w:afterAutospacing="0" w:before="0" w:beforeAutospacing="0" w:line="240" w:lineRule="auto"/>
-        <w:ind w:left="720" w:hanging="360"/>
+        <w:spacing w:after="0" w:before="0" w:line="240" w:lineRule="auto"/>
+        <w:ind w:left="720" w:hanging="360"/>
+        <w:rPr/>
       </w:pPr>
       <w:r>
         <w:rPr>
@@ -1042,8 +1036,9 @@
           <w:ilvl w:val="0"/>
           <w:numId w:val="6"/>
         </w:numPr>
-        <w:spacing w:after="0" w:afterAutospacing="0" w:before="0" w:beforeAutospacing="0" w:line="240" w:lineRule="auto"/>
-        <w:ind w:left="720" w:hanging="360"/>
+        <w:spacing w:after="0" w:before="0" w:line="240" w:lineRule="auto"/>
+        <w:ind w:left="720" w:hanging="360"/>
+        <w:rPr/>
       </w:pPr>
       <w:r>
         <w:rPr>
@@ -1072,7 +1067,7 @@
           <w:ilvl w:val="0"/>
           <w:numId w:val="6"/>
         </w:numPr>
-        <w:spacing w:after="0" w:afterAutospacing="0" w:before="0" w:beforeAutospacing="0" w:line="240" w:lineRule="auto"/>
+        <w:spacing w:after="0" w:before="0" w:line="240" w:lineRule="auto"/>
         <w:ind w:left="720" w:hanging="360"/>
         <w:rPr/>
       </w:pPr>
@@ -1089,7 +1084,7 @@
           <w:ilvl w:val="0"/>
           <w:numId w:val="6"/>
         </w:numPr>
-        <w:spacing w:after="240" w:before="0" w:beforeAutospacing="0" w:line="240" w:lineRule="auto"/>
+        <w:spacing w:after="240" w:before="0" w:line="240" w:lineRule="auto"/>
         <w:ind w:left="720" w:hanging="360"/>
         <w:rPr/>
       </w:pPr>
@@ -1126,7 +1121,7 @@
           <w:ilvl w:val="0"/>
           <w:numId w:val="2"/>
         </w:numPr>
-        <w:spacing w:after="0" w:afterAutospacing="0" w:before="240" w:line="240" w:lineRule="auto"/>
+        <w:spacing w:after="0" w:before="240" w:line="240" w:lineRule="auto"/>
         <w:ind w:left="720" w:hanging="360"/>
         <w:rPr/>
       </w:pPr>
@@ -1138,6 +1133,11 @@
         </w:rPr>
         <w:t xml:space="preserve">Salesforce Certified AI Associate</w:t>
       </w:r>
+      <w:r>
+        <w:rPr>
+          <w:rtl w:val="0"/>
+        </w:rPr>
+      </w:r>
     </w:p>
     <w:p>
       <w:pPr>
@@ -1145,7 +1145,7 @@
           <w:ilvl w:val="0"/>
           <w:numId w:val="2"/>
         </w:numPr>
-        <w:spacing w:after="0" w:afterAutospacing="0" w:before="0" w:beforeAutospacing="0" w:line="240" w:lineRule="auto"/>
+        <w:spacing w:after="0" w:before="0" w:line="240" w:lineRule="auto"/>
         <w:ind w:left="720" w:hanging="360"/>
         <w:rPr/>
       </w:pPr>
@@ -1157,6 +1157,11 @@
         </w:rPr>
         <w:t xml:space="preserve">Salesforce Superbadge – App Customization Specialist</w:t>
       </w:r>
+      <w:r>
+        <w:rPr>
+          <w:rtl w:val="0"/>
+        </w:rPr>
+      </w:r>
     </w:p>
     <w:p>
       <w:pPr>
@@ -1164,7 +1169,7 @@
           <w:ilvl w:val="0"/>
           <w:numId w:val="2"/>
         </w:numPr>
-        <w:spacing w:after="0" w:afterAutospacing="0" w:before="0" w:beforeAutospacing="0" w:line="240" w:lineRule="auto"/>
+        <w:spacing w:after="0" w:before="0" w:line="240" w:lineRule="auto"/>
         <w:ind w:left="720" w:hanging="360"/>
         <w:rPr/>
       </w:pPr>
@@ -1176,6 +1181,11 @@
         </w:rPr>
         <w:t xml:space="preserve">Scrum Fundamentals Certified (SFC)</w:t>
       </w:r>
+      <w:r>
+        <w:rPr>
+          <w:rtl w:val="0"/>
+        </w:rPr>
+      </w:r>
     </w:p>
     <w:p>
       <w:pPr>
@@ -1183,7 +1193,7 @@
           <w:ilvl w:val="0"/>
           <w:numId w:val="2"/>
         </w:numPr>
-        <w:spacing w:after="240" w:before="0" w:beforeAutospacing="0" w:line="240" w:lineRule="auto"/>
+        <w:spacing w:after="240" w:before="0" w:line="240" w:lineRule="auto"/>
         <w:ind w:left="720" w:hanging="360"/>
         <w:rPr/>
       </w:pPr>
@@ -1195,6 +1205,11 @@
         </w:rPr>
         <w:t xml:space="preserve">Google Cloud Computing Foundations Certificate</w:t>
       </w:r>
+      <w:r>
+        <w:rPr>
+          <w:rtl w:val="0"/>
+        </w:rPr>
+      </w:r>
     </w:p>
     <w:p>
       <w:pPr>
@@ -1239,7 +1254,7 @@
           <w:ilvl w:val="0"/>
           <w:numId w:val="5"/>
         </w:numPr>
-        <w:spacing w:after="0" w:afterAutospacing="0" w:before="240" w:line="240" w:lineRule="auto"/>
+        <w:spacing w:after="0" w:before="240" w:line="240" w:lineRule="auto"/>
         <w:ind w:left="720" w:hanging="360"/>
         <w:rPr/>
       </w:pPr>
@@ -1256,7 +1271,7 @@
           <w:ilvl w:val="0"/>
           <w:numId w:val="5"/>
         </w:numPr>
-        <w:spacing w:after="0" w:afterAutospacing="0" w:before="0" w:beforeAutospacing="0" w:line="240" w:lineRule="auto"/>
+        <w:spacing w:after="0" w:before="0" w:line="240" w:lineRule="auto"/>
         <w:ind w:left="720" w:hanging="360"/>
         <w:rPr/>
       </w:pPr>
@@ -1273,7 +1288,7 @@
           <w:ilvl w:val="0"/>
           <w:numId w:val="5"/>
         </w:numPr>
-        <w:spacing w:after="0" w:afterAutospacing="0" w:before="0" w:beforeAutospacing="0" w:line="240" w:lineRule="auto"/>
+        <w:spacing w:after="0" w:before="0" w:line="240" w:lineRule="auto"/>
         <w:ind w:left="720" w:hanging="360"/>
         <w:rPr/>
       </w:pPr>
@@ -1290,7 +1305,7 @@
           <w:ilvl w:val="0"/>
           <w:numId w:val="5"/>
         </w:numPr>
-        <w:spacing w:after="0" w:afterAutospacing="0" w:before="0" w:beforeAutospacing="0" w:line="240" w:lineRule="auto"/>
+        <w:spacing w:after="0" w:before="0" w:line="240" w:lineRule="auto"/>
         <w:ind w:left="720" w:hanging="360"/>
         <w:rPr/>
       </w:pPr>
@@ -1307,7 +1322,7 @@
           <w:ilvl w:val="0"/>
           <w:numId w:val="5"/>
         </w:numPr>
-        <w:spacing w:after="0" w:afterAutospacing="0" w:before="0" w:beforeAutospacing="0" w:line="240" w:lineRule="auto"/>
+        <w:spacing w:after="0" w:before="0" w:line="240" w:lineRule="auto"/>
         <w:ind w:left="720" w:hanging="360"/>
         <w:rPr/>
       </w:pPr>
@@ -1324,7 +1339,7 @@
           <w:ilvl w:val="0"/>
           <w:numId w:val="5"/>
         </w:numPr>
-        <w:spacing w:after="0" w:afterAutospacing="0" w:before="0" w:beforeAutospacing="0" w:line="240" w:lineRule="auto"/>
+        <w:spacing w:after="0" w:before="0" w:line="240" w:lineRule="auto"/>
         <w:ind w:left="720" w:hanging="360"/>
         <w:rPr/>
       </w:pPr>
@@ -1341,7 +1356,7 @@
           <w:ilvl w:val="0"/>
           <w:numId w:val="5"/>
         </w:numPr>
-        <w:spacing w:after="240" w:before="0" w:beforeAutospacing="0" w:line="240" w:lineRule="auto"/>
+        <w:spacing w:after="240" w:before="0" w:line="240" w:lineRule="auto"/>
         <w:ind w:left="720" w:hanging="360"/>
         <w:rPr/>
       </w:pPr>
@@ -1375,7 +1390,7 @@
           <w:ilvl w:val="0"/>
           <w:numId w:val="1"/>
         </w:numPr>
-        <w:spacing w:after="0" w:afterAutospacing="0" w:before="240" w:line="240" w:lineRule="auto"/>
+        <w:spacing w:after="0" w:before="240" w:line="240" w:lineRule="auto"/>
         <w:ind w:left="720" w:hanging="360"/>
         <w:rPr/>
       </w:pPr>
@@ -1392,7 +1407,7 @@
           <w:ilvl w:val="0"/>
           <w:numId w:val="1"/>
         </w:numPr>
-        <w:spacing w:after="0" w:afterAutospacing="0" w:before="0" w:beforeAutospacing="0" w:line="240" w:lineRule="auto"/>
+        <w:spacing w:after="0" w:before="0" w:line="240" w:lineRule="auto"/>
         <w:ind w:left="720" w:hanging="360"/>
         <w:rPr/>
       </w:pPr>
@@ -1409,7 +1424,7 @@
           <w:ilvl w:val="0"/>
           <w:numId w:val="1"/>
         </w:numPr>
-        <w:spacing w:after="0" w:afterAutospacing="0" w:before="0" w:beforeAutospacing="0" w:line="240" w:lineRule="auto"/>
+        <w:spacing w:after="0" w:before="0" w:line="240" w:lineRule="auto"/>
         <w:ind w:left="720" w:hanging="360"/>
         <w:rPr/>
       </w:pPr>
@@ -1426,7 +1441,7 @@
           <w:ilvl w:val="0"/>
           <w:numId w:val="1"/>
         </w:numPr>
-        <w:spacing w:after="0" w:afterAutospacing="0" w:before="0" w:beforeAutospacing="0" w:line="240" w:lineRule="auto"/>
+        <w:spacing w:after="0" w:before="0" w:line="240" w:lineRule="auto"/>
         <w:ind w:left="720" w:hanging="360"/>
         <w:rPr/>
       </w:pPr>
@@ -1443,7 +1458,7 @@
           <w:ilvl w:val="0"/>
           <w:numId w:val="1"/>
         </w:numPr>
-        <w:spacing w:after="0" w:afterAutospacing="0" w:before="0" w:beforeAutospacing="0" w:line="240" w:lineRule="auto"/>
+        <w:spacing w:after="0" w:before="0" w:line="240" w:lineRule="auto"/>
         <w:ind w:left="720" w:hanging="360"/>
         <w:rPr/>
       </w:pPr>
@@ -1460,7 +1475,7 @@
           <w:ilvl w:val="0"/>
           <w:numId w:val="1"/>
         </w:numPr>
-        <w:spacing w:after="0" w:afterAutospacing="0" w:before="0" w:beforeAutospacing="0" w:line="240" w:lineRule="auto"/>
+        <w:spacing w:after="0" w:before="0" w:line="240" w:lineRule="auto"/>
         <w:ind w:left="720" w:hanging="360"/>
         <w:rPr/>
       </w:pPr>
@@ -1477,7 +1492,7 @@
           <w:ilvl w:val="0"/>
           <w:numId w:val="1"/>
         </w:numPr>
-        <w:spacing w:after="0" w:afterAutospacing="0" w:before="0" w:beforeAutospacing="0" w:line="240" w:lineRule="auto"/>
+        <w:spacing w:after="0" w:before="0" w:line="240" w:lineRule="auto"/>
         <w:ind w:left="720" w:hanging="360"/>
         <w:rPr/>
       </w:pPr>
@@ -1494,7 +1509,7 @@
           <w:ilvl w:val="0"/>
           <w:numId w:val="1"/>
         </w:numPr>
-        <w:spacing w:after="0" w:afterAutospacing="0" w:before="0" w:beforeAutospacing="0" w:line="240" w:lineRule="auto"/>
+        <w:spacing w:after="0" w:before="0" w:line="240" w:lineRule="auto"/>
         <w:ind w:left="720" w:hanging="360"/>
         <w:rPr/>
       </w:pPr>
@@ -1511,7 +1526,7 @@
           <w:ilvl w:val="0"/>
           <w:numId w:val="1"/>
         </w:numPr>
-        <w:spacing w:after="0" w:afterAutospacing="0" w:before="0" w:beforeAutospacing="0" w:line="240" w:lineRule="auto"/>
+        <w:spacing w:after="0" w:before="0" w:line="240" w:lineRule="auto"/>
         <w:ind w:left="720" w:hanging="360"/>
         <w:rPr/>
       </w:pPr>
@@ -1528,7 +1543,7 @@
           <w:ilvl w:val="0"/>
           <w:numId w:val="1"/>
         </w:numPr>
-        <w:spacing w:after="0" w:afterAutospacing="0" w:before="0" w:beforeAutospacing="0" w:line="240" w:lineRule="auto"/>
+        <w:spacing w:after="0" w:before="0" w:line="240" w:lineRule="auto"/>
         <w:ind w:left="720" w:hanging="360"/>
         <w:rPr/>
       </w:pPr>
@@ -1545,7 +1560,7 @@
           <w:ilvl w:val="0"/>
           <w:numId w:val="1"/>
         </w:numPr>
-        <w:spacing w:after="240" w:before="0" w:beforeAutospacing="0" w:line="240" w:lineRule="auto"/>
+        <w:spacing w:after="240" w:before="0" w:line="240" w:lineRule="auto"/>
         <w:ind w:left="720" w:hanging="360"/>
         <w:rPr/>
       </w:pPr>
@@ -1579,7 +1594,7 @@
           <w:ilvl w:val="0"/>
           <w:numId w:val="3"/>
         </w:numPr>
-        <w:spacing w:after="0" w:afterAutospacing="0" w:before="240" w:line="240" w:lineRule="auto"/>
+        <w:spacing w:after="0" w:before="240" w:line="240" w:lineRule="auto"/>
         <w:ind w:left="720" w:hanging="360"/>
         <w:rPr/>
       </w:pPr>
@@ -1596,7 +1611,7 @@
           <w:ilvl w:val="0"/>
           <w:numId w:val="3"/>
         </w:numPr>
-        <w:spacing w:after="0" w:afterAutospacing="0" w:before="0" w:beforeAutospacing="0" w:line="240" w:lineRule="auto"/>
+        <w:spacing w:after="0" w:before="0" w:line="240" w:lineRule="auto"/>
         <w:ind w:left="720" w:hanging="360"/>
         <w:rPr/>
       </w:pPr>
@@ -1613,7 +1628,7 @@
           <w:ilvl w:val="0"/>
           <w:numId w:val="3"/>
         </w:numPr>
-        <w:spacing w:after="0" w:afterAutospacing="0" w:before="0" w:beforeAutospacing="0" w:line="240" w:lineRule="auto"/>
+        <w:spacing w:after="0" w:before="0" w:line="240" w:lineRule="auto"/>
         <w:ind w:left="720" w:hanging="360"/>
         <w:rPr/>
       </w:pPr>
@@ -1630,7 +1645,7 @@
           <w:ilvl w:val="0"/>
           <w:numId w:val="3"/>
         </w:numPr>
-        <w:spacing w:after="0" w:afterAutospacing="0" w:before="0" w:beforeAutospacing="0" w:line="240" w:lineRule="auto"/>
+        <w:spacing w:after="0" w:before="0" w:line="240" w:lineRule="auto"/>
         <w:ind w:left="720" w:hanging="360"/>
         <w:rPr/>
       </w:pPr>
@@ -1647,7 +1662,7 @@
           <w:ilvl w:val="0"/>
           <w:numId w:val="3"/>
         </w:numPr>
-        <w:spacing w:after="0" w:afterAutospacing="0" w:before="0" w:beforeAutospacing="0" w:line="240" w:lineRule="auto"/>
+        <w:spacing w:after="0" w:before="0" w:line="240" w:lineRule="auto"/>
         <w:ind w:left="720" w:hanging="360"/>
         <w:rPr/>
       </w:pPr>
@@ -1664,7 +1679,7 @@
           <w:ilvl w:val="0"/>
           <w:numId w:val="3"/>
         </w:numPr>
-        <w:spacing w:after="0" w:afterAutospacing="0" w:before="0" w:beforeAutospacing="0" w:line="240" w:lineRule="auto"/>
+        <w:spacing w:after="0" w:before="0" w:line="240" w:lineRule="auto"/>
         <w:ind w:left="720" w:hanging="360"/>
         <w:rPr/>
       </w:pPr>
@@ -1681,7 +1696,7 @@
           <w:ilvl w:val="0"/>
           <w:numId w:val="3"/>
         </w:numPr>
-        <w:spacing w:after="0" w:afterAutospacing="0" w:before="0" w:beforeAutospacing="0" w:line="240" w:lineRule="auto"/>
+        <w:spacing w:after="0" w:before="0" w:line="240" w:lineRule="auto"/>
         <w:ind w:left="720" w:hanging="360"/>
         <w:rPr/>
       </w:pPr>
@@ -1698,7 +1713,7 @@
           <w:ilvl w:val="0"/>
           <w:numId w:val="3"/>
         </w:numPr>
-        <w:spacing w:after="240" w:before="0" w:beforeAutospacing="0" w:line="240" w:lineRule="auto"/>
+        <w:spacing w:after="240" w:before="0" w:line="240" w:lineRule="auto"/>
         <w:ind w:left="720" w:hanging="360"/>
         <w:rPr/>
       </w:pPr>
@@ -1732,7 +1747,7 @@
           <w:ilvl w:val="0"/>
           <w:numId w:val="4"/>
         </w:numPr>
-        <w:spacing w:after="0" w:afterAutospacing="0" w:before="240" w:line="240" w:lineRule="auto"/>
+        <w:spacing w:after="0" w:before="240" w:line="240" w:lineRule="auto"/>
         <w:ind w:left="720" w:hanging="360"/>
         <w:rPr/>
       </w:pPr>
@@ -1749,7 +1764,7 @@
           <w:ilvl w:val="0"/>
           <w:numId w:val="4"/>
         </w:numPr>
-        <w:spacing w:after="0" w:afterAutospacing="0" w:before="0" w:beforeAutospacing="0" w:line="240" w:lineRule="auto"/>
+        <w:spacing w:after="0" w:before="0" w:line="240" w:lineRule="auto"/>
         <w:ind w:left="720" w:hanging="360"/>
         <w:rPr/>
       </w:pPr>
@@ -1766,7 +1781,7 @@
           <w:ilvl w:val="0"/>
           <w:numId w:val="4"/>
         </w:numPr>
-        <w:spacing w:after="0" w:afterAutospacing="0" w:before="0" w:beforeAutospacing="0" w:line="240" w:lineRule="auto"/>
+        <w:spacing w:after="0" w:before="0" w:line="240" w:lineRule="auto"/>
         <w:ind w:left="720" w:hanging="360"/>
         <w:rPr/>
       </w:pPr>
@@ -1783,7 +1798,7 @@
           <w:ilvl w:val="0"/>
           <w:numId w:val="4"/>
         </w:numPr>
-        <w:spacing w:after="0" w:afterAutospacing="0" w:before="0" w:beforeAutospacing="0" w:line="240" w:lineRule="auto"/>
+        <w:spacing w:after="0" w:before="0" w:line="240" w:lineRule="auto"/>
         <w:ind w:left="720" w:hanging="360"/>
         <w:rPr/>
       </w:pPr>
@@ -1800,7 +1815,7 @@
           <w:ilvl w:val="0"/>
           <w:numId w:val="4"/>
         </w:numPr>
-        <w:spacing w:after="0" w:afterAutospacing="0" w:before="0" w:beforeAutospacing="0" w:line="240" w:lineRule="auto"/>
+        <w:spacing w:after="0" w:before="0" w:line="240" w:lineRule="auto"/>
         <w:ind w:left="720" w:hanging="360"/>
         <w:rPr/>
       </w:pPr>
@@ -1817,7 +1832,7 @@
           <w:ilvl w:val="0"/>
           <w:numId w:val="4"/>
         </w:numPr>
-        <w:spacing w:after="0" w:afterAutospacing="0" w:before="0" w:beforeAutospacing="0" w:line="240" w:lineRule="auto"/>
+        <w:spacing w:after="0" w:before="0" w:line="240" w:lineRule="auto"/>
         <w:ind w:left="720" w:hanging="360"/>
         <w:rPr/>
       </w:pPr>
@@ -1834,7 +1849,7 @@
           <w:ilvl w:val="0"/>
           <w:numId w:val="4"/>
         </w:numPr>
-        <w:spacing w:after="240" w:before="0" w:beforeAutospacing="0" w:line="240" w:lineRule="auto"/>
+        <w:spacing w:after="240" w:before="0" w:line="240" w:lineRule="auto"/>
         <w:ind w:left="720" w:hanging="360"/>
         <w:rPr/>
       </w:pPr>
@@ -3111,6 +3126,20 @@
       <w:sz w:val="52"/>
       <w:szCs w:val="52"/>
     </w:rPr>
+  </w:style>
+  <w:style w:type="table" w:styleId="TableNormal" w:default="1">
+    <w:name w:val="TableNormal"/>
+    <w:tblPr>
+      <w:tblCellMar>
+        <w:top w:w="100.0" w:type="dxa"/>
+        <w:left w:w="100.0" w:type="dxa"/>
+        <w:bottom w:w="100.0" w:type="dxa"/>
+        <w:right w:w="100.0" w:type="dxa"/>
+      </w:tblCellMar>
+    </w:tblPr>
+  </w:style>
+  <w:style w:type="paragraph" w:styleId="Normal" w:default="1">
+    <w:name w:val="normal"/>
   </w:style>
   <w:style w:type="paragraph" w:styleId="Subtitle">
     <w:name w:val="Subtitle"/>
@@ -3452,4 +3481,19 @@
   </a:objectDefaults>
   <a:extraClrSchemeLst/>
 </a:theme>
+</file>
+
+<file path=customXML/item1.xml><?xml version="1.0" encoding="utf-8"?>
+<go:gDocsCustomXmlDataStorage xmlns:go="http://customooxmlschemas.google.com/" xmlns:r="http://schemas.openxmlformats.org/officeDocument/2006/relationships" uri="GoogleDocsCustomDataVersion2">
+  <go:docsCustomData xmlns:go="http://customooxmlschemas.google.com/" roundtripDataSignature="AMtx7mjnrNznh3UKAD9YicSUcbNEYS5+lw==">CgMxLjAyDmguNWhvZHl1dHBndm5jOAByITFZTC1DV3JzT0Y1QmY2N3ZmQXNaeUl1QlJISG5jR0FKdw==</go:docsCustomData>
+</go:gDocsCustomXmlDataStorage>
+</file>
+
+<file path=customXML/itemProps1.xml><?xml version="1.0" encoding="utf-8"?>
+<ds:datastoreItem xmlns:ds="http://schemas.openxmlformats.org/officeDocument/2006/customXml" ds:itemID="{11111111-1234-1234-1234-123412341234}">
+  <ds:schemaRefs>
+    <ds:schemaRef ds:uri="http://schemas.openxmlformats.org/officeDocument/2006/relationships"/>
+    <ds:schemaRef ds:uri="http://customooxmlschemas.google.com/"/>
+  </ds:schemaRefs>
+</ds:datastoreItem>
 </file>
</xml_diff>